<commit_message>
feat(workflow): release native cross-references v2
</commit_message>
<xml_diff>
--- a/latex-to-word-workflow/assets/reference.docx
+++ b/latex-to-word-workflow/assets/reference.docx
@@ -52,10 +52,170 @@
     </w:p>
     <w:p>
       <w:pPr>
+        <w:pStyle w:val="BodyText"/>
+      </w:pPr>
+      <w:r>
+        <w:t xml:space="preserve">Native Word cross-reference examples: Fig. </w:t>
+      </w:r>
+      <w:r>
+        <w:fldChar w:fldCharType="begin"/>
+      </w:r>
+      <w:r>
+        <w:instrText xml:space="preserve"> REF RefFig001 \h </w:instrText>
+      </w:r>
+      <w:r>
+        <w:fldChar w:fldCharType="separate"/>
+      </w:r>
+      <w:r>
+        <w:rPr>
+          <w:b w:val="0"/>
+          <w:noProof/>
+        </w:rPr>
+        <w:t>1</w:t>
+      </w:r>
+      <w:r>
+        <w:fldChar w:fldCharType="end"/>
+      </w:r>
+      <w:r>
+        <w:t xml:space="preserve">, Table </w:t>
+      </w:r>
+      <w:r>
+        <w:fldChar w:fldCharType="begin"/>
+      </w:r>
+      <w:r>
+        <w:instrText xml:space="preserve"> REF RefTable001 \h </w:instrText>
+      </w:r>
+      <w:r>
+        <w:fldChar w:fldCharType="separate"/>
+      </w:r>
+      <w:r>
+        <w:rPr>
+          <w:b w:val="0"/>
+          <w:noProof/>
+        </w:rPr>
+        <w:t>1</w:t>
+      </w:r>
+      <w:r>
+        <w:fldChar w:fldCharType="end"/>
+      </w:r>
+      <w:r>
+        <w:t>, and Eq. (</w:t>
+      </w:r>
+      <w:r>
+        <w:fldChar w:fldCharType="begin"/>
+      </w:r>
+      <w:r>
+        <w:instrText xml:space="preserve"> REF RefEquation001 \h </w:instrText>
+      </w:r>
+      <w:r>
+        <w:fldChar w:fldCharType="separate"/>
+      </w:r>
+      <w:r>
+        <w:rPr>
+          <w:b w:val="0"/>
+          <w:noProof/>
+        </w:rPr>
+        <w:t>1</w:t>
+      </w:r>
+      <w:r>
+        <w:fldChar w:fldCharType="end"/>
+      </w:r>
+      <w:r>
+        <w:t>).</w:t>
+      </w:r>
+    </w:p>
+    <w:p>
+      <w:pPr>
+        <w:pStyle w:val="Equation"/>
+      </w:pPr>
+      <m:oMath>
+        <m:r>
+          <m:t>E</m:t>
+        </m:r>
+        <m:r>
+          <m:t>=</m:t>
+        </m:r>
+        <m:r>
+          <m:t>m</m:t>
+        </m:r>
+        <m:sSup>
+          <m:e>
+            <m:r>
+              <m:t>c</m:t>
+            </m:r>
+          </m:e>
+          <m:sup>
+            <m:r>
+              <m:t>2</m:t>
+            </m:r>
+          </m:sup>
+        </m:sSup>
+      </m:oMath>
+      <w:r>
+        <w:t xml:space="preserve">    (</w:t>
+      </w:r>
+      <w:bookmarkStart w:id="1" w:name="RefEquation001"/>
+      <w:r>
+        <w:fldChar w:fldCharType="begin"/>
+      </w:r>
+      <w:r>
+        <w:instrText xml:space="preserve"> SEQ Equation \* ARABIC </w:instrText>
+      </w:r>
+      <w:r>
+        <w:fldChar w:fldCharType="separate"/>
+      </w:r>
+      <w:r>
+        <w:rPr>
+          <w:b w:val="0"/>
+          <w:noProof/>
+        </w:rPr>
+        <w:t>1</w:t>
+      </w:r>
+      <w:r>
+        <w:fldChar w:fldCharType="end"/>
+      </w:r>
+      <w:bookmarkEnd w:id="1"/>
+      <w:r>
+        <w:t>)</w:t>
+      </w:r>
+    </w:p>
+    <w:p>
+      <w:pPr>
         <w:pStyle w:val="Figure"/>
       </w:pPr>
       <w:r>
-        <w:t>[FIGURE AREA]</w:t>
+        <w:drawing>
+          <wp:inline xmlns:a="http://schemas.openxmlformats.org/drawingml/2006/main" xmlns:pic="http://schemas.openxmlformats.org/drawingml/2006/picture">
+            <wp:extent cx="4140000" cy="1656000"/>
+            <wp:docPr id="1" name="Picture 1"/>
+            <wp:cNvGraphicFramePr>
+              <a:graphicFrameLocks noChangeAspect="1"/>
+            </wp:cNvGraphicFramePr>
+            <a:graphic>
+              <a:graphicData uri="http://schemas.openxmlformats.org/drawingml/2006/picture">
+                <pic:pic>
+                  <pic:nvPicPr>
+                    <pic:cNvPr id="0" name="figure.png"/>
+                    <pic:cNvPicPr/>
+                  </pic:nvPicPr>
+                  <pic:blipFill>
+                    <a:blip r:embed="rId9"/>
+                    <a:stretch>
+                      <a:fillRect/>
+                    </a:stretch>
+                  </pic:blipFill>
+                  <pic:spPr>
+                    <a:xfrm>
+                      <a:off x="0" y="0"/>
+                      <a:ext cx="4140000" cy="1656000"/>
+                    </a:xfrm>
+                    <a:prstGeom prst="rect"/>
+                  </pic:spPr>
+                </pic:pic>
+              </a:graphicData>
+            </a:graphic>
+          </wp:inline>
+        </w:drawing>
       </w:r>
     </w:p>
     <w:p>
@@ -63,15 +223,105 @@
         <w:pStyle w:val="Caption"/>
       </w:pPr>
       <w:r>
-        <w:t>Figure 1. Example figure caption with enough text to demonstrate alignment and spacing.</w:t>
+        <w:rPr>
+          <w:b/>
+        </w:rPr>
+        <w:t xml:space="preserve">Fig. </w:t>
+      </w:r>
+      <w:bookmarkStart w:id="2" w:name="RefFig001"/>
+      <w:r>
+        <w:rPr>
+          <w:b/>
+        </w:rPr>
+        <w:fldChar w:fldCharType="begin"/>
+      </w:r>
+      <w:r>
+        <w:rPr>
+          <w:b/>
+        </w:rPr>
+        <w:instrText xml:space="preserve"> SEQ Fig. \* ARABIC </w:instrText>
+      </w:r>
+      <w:r>
+        <w:rPr>
+          <w:b/>
+        </w:rPr>
+        <w:fldChar w:fldCharType="separate"/>
+      </w:r>
+      <w:r>
+        <w:rPr>
+          <w:b/>
+          <w:noProof/>
+        </w:rPr>
+        <w:t>1</w:t>
+      </w:r>
+      <w:r>
+        <w:rPr>
+          <w:b/>
+        </w:rPr>
+        <w:fldChar w:fldCharType="end"/>
+      </w:r>
+      <w:bookmarkEnd w:id="2"/>
+      <w:r>
+        <w:rPr>
+          <w:b/>
+        </w:rPr>
+        <w:t xml:space="preserve">. </w:t>
+      </w:r>
+      <w:r>
+        <w:t>Example figure caption demonstrating native numbering and caption style.</w:t>
       </w:r>
     </w:p>
     <w:p>
       <w:pPr>
-        <w:pStyle w:val="Bibliography"/>
+        <w:pStyle w:val="Caption"/>
       </w:pPr>
       <w:r>
-        <w:t>[1] A. Author, B. Author, Example article title, Journal 10 (2025) 100-110. https://doi.org/10.0000/example.</w:t>
+        <w:rPr>
+          <w:b/>
+        </w:rPr>
+        <w:t xml:space="preserve">Table </w:t>
+      </w:r>
+      <w:bookmarkStart w:id="3" w:name="RefTable001"/>
+      <w:r>
+        <w:rPr>
+          <w:b/>
+        </w:rPr>
+        <w:fldChar w:fldCharType="begin"/>
+      </w:r>
+      <w:r>
+        <w:rPr>
+          <w:b/>
+        </w:rPr>
+        <w:instrText xml:space="preserve"> SEQ Table \* ARABIC </w:instrText>
+      </w:r>
+      <w:r>
+        <w:rPr>
+          <w:b/>
+        </w:rPr>
+        <w:fldChar w:fldCharType="separate"/>
+      </w:r>
+      <w:r>
+        <w:rPr>
+          <w:b/>
+          <w:noProof/>
+        </w:rPr>
+        <w:t>1</w:t>
+      </w:r>
+      <w:r>
+        <w:rPr>
+          <w:b/>
+        </w:rPr>
+        <w:fldChar w:fldCharType="end"/>
+      </w:r>
+      <w:bookmarkEnd w:id="3"/>
+      <w:r>
+        <w:rPr>
+          <w:b/>
+        </w:rPr>
+        <w:t xml:space="preserve">. </w:t>
+      </w:r>
+      <w:r>
+        <w:t>Example table caption demonstrating native numbering and caption style.</w:t>
       </w:r>
     </w:p>
     <w:tbl>
@@ -180,6 +430,14 @@
         </w:tc>
       </w:tr>
     </w:tbl>
+    <w:p>
+      <w:pPr>
+        <w:pStyle w:val="Bibliography"/>
+      </w:pPr>
+      <w:r>
+        <w:t>[1] A. Author, B. Author, Example article title, Journal 10 (2025) 100-110. https://doi.org/10.0000/example.</w:t>
+      </w:r>
+    </w:p>
     <w:sectPr>
       <w:pgSz w:w="11906" w:h="16838"/>
       <w:pgMar w:top="1440" w:right="1440" w:bottom="1440" w:left="1440" w:header="720" w:footer="720" w:gutter="0"/>
@@ -1378,7 +1636,7 @@
       <w:rFonts w:ascii="Times New Roman" w:hAnsi="Times New Roman"/>
       <w:b w:val="0"/>
       <w:bCs/>
-      <w:color w:val="4F81BD" w:themeColor="accent1"/>
+      <w:color w:val="000000"/>
       <w:sz w:val="18"/>
       <w:szCs w:val="18"/>
     </w:rPr>
@@ -12274,6 +12532,20 @@
     <w:pPr>
       <w:keepNext/>
       <w:spacing w:before="120" w:after="60"/>
+      <w:ind w:firstLine="0"/>
+      <w:jc w:val="center"/>
+    </w:pPr>
+    <w:rPr>
+      <w:rFonts w:ascii="Times New Roman" w:hAnsi="Times New Roman"/>
+      <w:b w:val="0"/>
+      <w:sz w:val="21"/>
+    </w:rPr>
+  </w:style>
+  <w:style w:type="paragraph" w:customStyle="1" w:styleId="Equation">
+    <w:name w:val="Equation"/>
+    <w:qFormat/>
+    <w:pPr>
+      <w:spacing w:before="120" w:after="120"/>
       <w:ind w:firstLine="0"/>
       <w:jc w:val="center"/>
     </w:pPr>

</xml_diff>